<commit_message>
Pages CMS fixes: automatic archiving, etc.
</commit_message>
<xml_diff>
--- a/docs/Boxborough News - Editor's Guide.docx
+++ b/docs/Boxborough News - Editor's Guide.docx
@@ -2,7 +2,7 @@
 <file path=word/document.xml><?xml version="1.0" encoding="utf-8"?>
 <w:document xmlns:w="http://schemas.openxmlformats.org/wordprocessingml/2006/main" xmlns:m="http://schemas.openxmlformats.org/officeDocument/2006/math" xmlns:r="http://schemas.openxmlformats.org/officeDocument/2006/relationships" xmlns:o="urn:schemas-microsoft-com:office:office" xmlns:v="urn:schemas-microsoft-com:vml" xmlns:w10="urn:schemas-microsoft-com:office:word" xmlns:a="http://schemas.openxmlformats.org/drawingml/2006/main" xmlns:pic="http://schemas.openxmlformats.org/drawingml/2006/picture" xmlns:wp="http://schemas.openxmlformats.org/drawingml/2006/wordprocessingDrawing">
   <w:body>
-    <w:bookmarkStart w:id="32" w:name="boxborough-news-editors-guide"/>
+    <w:bookmarkStart w:id="33" w:name="boxborough-news-editors-guide"/>
     <w:p>
       <w:pPr>
         <w:pStyle w:val="Heading1"/>
@@ -167,23 +167,23 @@
               <w:t xml:space="preserve"> </w:t>
             </w:r>
             <w:r>
-              <w:t xml:space="preserve">for the week. Update the</w:t>
-            </w:r>
-            <w:r>
-              <w:t xml:space="preserve"> </w:t>
-            </w:r>
-            <w:r>
-              <w:rPr>
-                <w:bCs/>
-                <w:b/>
-              </w:rPr>
-              <w:t xml:space="preserve">Town Hall note</w:t>
-            </w:r>
-            <w:r>
-              <w:t xml:space="preserve"> </w:t>
-            </w:r>
-            <w:r>
-              <w:t xml:space="preserve">for the week ahead.</w:t>
+              <w:t xml:space="preserve">for the week. Optional: add a</w:t>
+            </w:r>
+            <w:r>
+              <w:t xml:space="preserve"> </w:t>
+            </w:r>
+            <w:r>
+              <w:rPr>
+                <w:bCs/>
+                <w:b/>
+              </w:rPr>
+              <w:t xml:space="preserve">Town meetings note</w:t>
+            </w:r>
+            <w:r>
+              <w:t xml:space="preserve"> </w:t>
+            </w:r>
+            <w:r>
+              <w:t xml:space="preserve">if a meeting next week deserves a heads-up.</w:t>
             </w:r>
           </w:p>
         </w:tc>
@@ -341,7 +341,7 @@
       </w:r>
     </w:p>
     <w:bookmarkEnd w:id="21"/>
-    <w:bookmarkStart w:id="25" w:name="writing-an-article"/>
+    <w:bookmarkStart w:id="26" w:name="writing-an-article"/>
     <w:p>
       <w:pPr>
         <w:pStyle w:val="Heading2"/>
@@ -1197,7 +1197,7 @@
         <w:t xml:space="preserve">Save</w:t>
       </w:r>
       <w:r>
-        <w:t xml:space="preserve">. Articles from before September 2026 (imported from the old website) are under</w:t>
+        <w:t xml:space="preserve">. The</w:t>
       </w:r>
       <w:r>
         <w:t xml:space="preserve"> </w:t>
@@ -1207,13 +1207,58 @@
           <w:bCs/>
           <w:b/>
         </w:rPr>
-        <w:t xml:space="preserve">Archive: articles before Sept. 2026</w:t>
-      </w:r>
-      <w:r>
-        <w:t xml:space="preserve"> </w:t>
-      </w:r>
-      <w:r>
-        <w:t xml:space="preserve">in the left menu. The live site updates in about two minutes. For a significant correction, add a line at the end of the article, e.g. </w:t>
+        <w:t xml:space="preserve">Articles</w:t>
+      </w:r>
+      <w:r>
+        <w:t xml:space="preserve"> </w:t>
+      </w:r>
+      <w:r>
+        <w:t xml:space="preserve">list holds the last two months. Older articles are under</w:t>
+      </w:r>
+      <w:r>
+        <w:t xml:space="preserve"> </w:t>
+      </w:r>
+      <w:r>
+        <w:rPr>
+          <w:bCs/>
+          <w:b/>
+        </w:rPr>
+        <w:t xml:space="preserve">Archive: older articles</w:t>
+      </w:r>
+      <w:r>
+        <w:t xml:space="preserve"> </w:t>
+      </w:r>
+      <w:r>
+        <w:t xml:space="preserve">in the left menu, in a folder for each year and month (for example,</w:t>
+      </w:r>
+      <w:r>
+        <w:t xml:space="preserve"> </w:t>
+      </w:r>
+      <w:r>
+        <w:rPr>
+          <w:bCs/>
+          <w:b/>
+        </w:rPr>
+        <w:t xml:space="preserve">2025</w:t>
+      </w:r>
+      <w:r>
+        <w:t xml:space="preserve"> </w:t>
+      </w:r>
+      <w:r>
+        <w:t xml:space="preserve">→</w:t>
+      </w:r>
+      <w:r>
+        <w:t xml:space="preserve"> </w:t>
+      </w:r>
+      <w:r>
+        <w:rPr>
+          <w:bCs/>
+          <w:b/>
+        </w:rPr>
+        <w:t xml:space="preserve">06</w:t>
+      </w:r>
+      <w:r>
+        <w:t xml:space="preserve">). The live site updates in about two minutes. For a significant correction, add a line at the end of the article, e.g. </w:t>
       </w:r>
       <w:r>
         <w:rPr>
@@ -1238,7 +1283,70 @@
       </w:r>
     </w:p>
     <w:bookmarkEnd w:id="23"/>
-    <w:bookmarkStart w:id="24" w:name="taking-an-article-down"/>
+    <w:bookmarkStart w:id="24" w:name="where-older-articles-go"/>
+    <w:p>
+      <w:pPr>
+        <w:pStyle w:val="Heading3"/>
+      </w:pPr>
+      <w:r>
+        <w:t xml:space="preserve">Where older articles go</w:t>
+      </w:r>
+    </w:p>
+    <w:p>
+      <w:pPr>
+        <w:pStyle w:val="FirstParagraph"/>
+      </w:pPr>
+      <w:r>
+        <w:t xml:space="preserve">On the 1st of each month, articles more than two months old move automatically from</w:t>
+      </w:r>
+      <w:r>
+        <w:t xml:space="preserve"> </w:t>
+      </w:r>
+      <w:r>
+        <w:rPr>
+          <w:bCs/>
+          <w:b/>
+        </w:rPr>
+        <w:t xml:space="preserve">Articles</w:t>
+      </w:r>
+      <w:r>
+        <w:t xml:space="preserve"> </w:t>
+      </w:r>
+      <w:r>
+        <w:t xml:space="preserve">to</w:t>
+      </w:r>
+      <w:r>
+        <w:t xml:space="preserve"> </w:t>
+      </w:r>
+      <w:r>
+        <w:rPr>
+          <w:bCs/>
+          <w:b/>
+        </w:rPr>
+        <w:t xml:space="preserve">Archive: older articles</w:t>
+      </w:r>
+      <w:r>
+        <w:t xml:space="preserve">, into a folder for their year and month. This only tidies the editors’ list. Nothing changes on the website: each article keeps its address, its place in News or Features, and its spot in search and the Archive pages. To move them right away, use</w:t>
+      </w:r>
+      <w:r>
+        <w:t xml:space="preserve"> </w:t>
+      </w:r>
+      <w:r>
+        <w:rPr>
+          <w:bCs/>
+          <w:b/>
+        </w:rPr>
+        <w:t xml:space="preserve">Move older articles to the archive</w:t>
+      </w:r>
+      <w:r>
+        <w:t xml:space="preserve"> </w:t>
+      </w:r>
+      <w:r>
+        <w:t xml:space="preserve">under Actions.</w:t>
+      </w:r>
+    </w:p>
+    <w:bookmarkEnd w:id="24"/>
+    <w:bookmarkStart w:id="25" w:name="taking-an-article-down"/>
     <w:p>
       <w:pPr>
         <w:pStyle w:val="Heading3"/>
@@ -1304,9 +1412,9 @@
         </w:pict>
       </w:r>
     </w:p>
-    <w:bookmarkEnd w:id="24"/>
     <w:bookmarkEnd w:id="25"/>
-    <w:bookmarkStart w:id="27" w:name="events-notices"/>
+    <w:bookmarkEnd w:id="26"/>
+    <w:bookmarkStart w:id="28" w:name="events-notices"/>
     <w:p>
       <w:pPr>
         <w:pStyle w:val="Heading2"/>
@@ -2138,7 +2246,7 @@
         </w:tc>
       </w:tr>
     </w:tbl>
-    <w:bookmarkStart w:id="26" w:name="submissions"/>
+    <w:bookmarkStart w:id="27" w:name="submissions"/>
     <w:p>
       <w:pPr>
         <w:pStyle w:val="Heading3"/>
@@ -2191,15 +2299,15 @@
         </w:pict>
       </w:r>
     </w:p>
-    <w:bookmarkEnd w:id="26"/>
     <w:bookmarkEnd w:id="27"/>
-    <w:bookmarkStart w:id="28" w:name="the-town-hall-note"/>
+    <w:bookmarkEnd w:id="28"/>
+    <w:bookmarkStart w:id="29" w:name="town-meetings-and-the-optional-note"/>
     <w:p>
       <w:pPr>
         <w:pStyle w:val="Heading2"/>
       </w:pPr>
       <w:r>
-        <w:t xml:space="preserve">The Town Hall note</w:t>
+        <w:t xml:space="preserve">Town meetings and the optional note</w:t>
       </w:r>
     </w:p>
     <w:p>
@@ -2207,23 +2315,15 @@
         <w:pStyle w:val="FirstParagraph"/>
       </w:pPr>
       <w:r>
-        <w:t xml:space="preserve">A sentence or two about the week’s most important town meetings. It appears at the top of the</w:t>
-      </w:r>
-      <w:r>
-        <w:t xml:space="preserve"> </w:t>
-      </w:r>
-      <w:r>
-        <w:rPr>
-          <w:bCs/>
-          <w:b/>
-        </w:rPr>
-        <w:t xml:space="preserve">Town meetings</w:t>
-      </w:r>
-      <w:r>
-        <w:t xml:space="preserve"> </w:t>
-      </w:r>
-      <w:r>
-        <w:t xml:space="preserve">list on the home page and the Events page, and in the email.</w:t>
+        <w:t xml:space="preserve">The list of upcoming town meetings on the home page, the Events page and in the email comes straight from the Town of Boxborough’s online calendar and updates itself twice a day, so there’s nothing to maintain.</w:t>
+      </w:r>
+    </w:p>
+    <w:p>
+      <w:pPr>
+        <w:pStyle w:val="BodyText"/>
+      </w:pPr>
+      <w:r>
+        <w:t xml:space="preserve">When a meeting deserves a heads-up (a big vote, a public hearing), you can add a short note above that list. Most weeks, leave it off.</w:t>
       </w:r>
     </w:p>
     <w:p>
@@ -2245,7 +2345,7 @@
           <w:bCs/>
           <w:b/>
         </w:rPr>
-        <w:t xml:space="preserve">Town Hall note</w:t>
+        <w:t xml:space="preserve">Town meetings note</w:t>
       </w:r>
       <w:r>
         <w:t xml:space="preserve"> </w:t>
@@ -2263,7 +2363,7 @@
         <w:pStyle w:val="Compact"/>
       </w:pPr>
       <w:r>
-        <w:t xml:space="preserve">Edit the text. Set</w:t>
+        <w:t xml:space="preserve">Tick</w:t>
       </w:r>
       <w:r>
         <w:t xml:space="preserve"> </w:t>
@@ -2273,13 +2373,13 @@
           <w:bCs/>
           <w:b/>
         </w:rPr>
-        <w:t xml:space="preserve">Hide automatically after</w:t>
-      </w:r>
-      <w:r>
-        <w:t xml:space="preserve"> </w:t>
-      </w:r>
-      <w:r>
-        <w:t xml:space="preserve">to the last day it applies, usually the next Saturday. The note then disappears by itself, so it never shows out-of-date information.</w:t>
+        <w:t xml:space="preserve">Show a note above the town meetings list</w:t>
+      </w:r>
+      <w:r>
+        <w:t xml:space="preserve"> </w:t>
+      </w:r>
+      <w:r>
+        <w:t xml:space="preserve">and write a sentence or two.</w:t>
       </w:r>
     </w:p>
     <w:p>
@@ -2291,7 +2391,7 @@
         <w:pStyle w:val="Compact"/>
       </w:pPr>
       <w:r>
-        <w:t xml:space="preserve">Untick</w:t>
+        <w:t xml:space="preserve">Set</w:t>
       </w:r>
       <w:r>
         <w:t xml:space="preserve"> </w:t>
@@ -2301,21 +2401,25 @@
           <w:bCs/>
           <w:b/>
         </w:rPr>
-        <w:t xml:space="preserve">Show the note</w:t>
-      </w:r>
-      <w:r>
-        <w:t xml:space="preserve"> </w:t>
-      </w:r>
-      <w:r>
-        <w:t xml:space="preserve">to hide it straight away.</w:t>
-      </w:r>
-    </w:p>
-    <w:p>
-      <w:pPr>
-        <w:pStyle w:val="FirstParagraph"/>
-      </w:pPr>
-      <w:r>
-        <w:t xml:space="preserve">The list of upcoming town meetings comes straight from the Town of Boxborough’s online calendar and updates itself twice a day, so there’s nothing to maintain. The website tidies up the town’s titles (for example, a joint meeting listed separately by three boards appears once).</w:t>
+        <w:t xml:space="preserve">Hide automatically after</w:t>
+      </w:r>
+      <w:r>
+        <w:t xml:space="preserve"> </w:t>
+      </w:r>
+      <w:r>
+        <w:t xml:space="preserve">to the last day it applies, usually the next Saturday. The note then disappears by itself, so it never shows out-of-date information.</w:t>
+      </w:r>
+    </w:p>
+    <w:p>
+      <w:pPr>
+        <w:numPr>
+          <w:ilvl w:val="0"/>
+          <w:numId w:val="1006"/>
+        </w:numPr>
+        <w:pStyle w:val="Compact"/>
+      </w:pPr>
+      <w:r>
+        <w:t xml:space="preserve">Leave the two calendar settings at the bottom as they are. The website tidies up the town’s titles (for example, a joint meeting listed separately by three boards appears once).</w:t>
       </w:r>
     </w:p>
     <w:p>
@@ -2325,8 +2429,8 @@
         </w:pict>
       </w:r>
     </w:p>
-    <w:bookmarkEnd w:id="28"/>
-    <w:bookmarkStart w:id="29" w:name="the-friday-email"/>
+    <w:bookmarkEnd w:id="29"/>
+    <w:bookmarkStart w:id="30" w:name="the-friday-email"/>
     <w:p>
       <w:pPr>
         <w:pStyle w:val="Heading2"/>
@@ -2365,7 +2469,7 @@
         <w:t xml:space="preserve"> </w:t>
       </w:r>
       <w:r>
-        <w:t xml:space="preserve">links to each article, plus the Town Hall note, upcoming town meetings and upcoming events. It saves the email as a</w:t>
+        <w:t xml:space="preserve">links to each article, plus the town meetings note (if any), upcoming town meetings and upcoming events. It saves the email as a</w:t>
       </w:r>
       <w:r>
         <w:t xml:space="preserve"> </w:t>
@@ -2624,8 +2728,8 @@
         </w:pict>
       </w:r>
     </w:p>
-    <w:bookmarkEnd w:id="29"/>
-    <w:bookmarkStart w:id="30" w:name="other-pages-and-settings"/>
+    <w:bookmarkEnd w:id="30"/>
+    <w:bookmarkStart w:id="31" w:name="other-pages-and-settings"/>
     <w:p>
       <w:pPr>
         <w:pStyle w:val="Heading2"/>
@@ -2741,8 +2845,8 @@
         </w:pict>
       </w:r>
     </w:p>
-    <w:bookmarkEnd w:id="30"/>
-    <w:bookmarkStart w:id="31" w:name="if-something-doesnt-look-right"/>
+    <w:bookmarkEnd w:id="31"/>
+    <w:bookmarkStart w:id="32" w:name="if-something-doesnt-look-right"/>
     <w:p>
       <w:pPr>
         <w:pStyle w:val="Heading2"/>
@@ -2858,7 +2962,7 @@
               <w:jc w:val="left"/>
             </w:pPr>
             <w:r>
-              <w:t xml:space="preserve">The home page still shows last week’s Town Hall note</w:t>
+              <w:t xml:space="preserve">The home page still shows last week’s town meetings note</w:t>
             </w:r>
           </w:p>
         </w:tc>
@@ -2886,7 +2990,33 @@
               <w:t xml:space="preserve"> </w:t>
             </w:r>
             <w:r>
-              <w:t xml:space="preserve">in the Town Hall note.</w:t>
+              <w:t xml:space="preserve">in</w:t>
+            </w:r>
+            <w:r>
+              <w:t xml:space="preserve"> </w:t>
+            </w:r>
+            <w:r>
+              <w:rPr>
+                <w:bCs/>
+                <w:b/>
+              </w:rPr>
+              <w:t xml:space="preserve">Town meetings note</w:t>
+            </w:r>
+            <w:r>
+              <w:t xml:space="preserve">, or untick</w:t>
+            </w:r>
+            <w:r>
+              <w:t xml:space="preserve"> </w:t>
+            </w:r>
+            <w:r>
+              <w:rPr>
+                <w:bCs/>
+                <w:b/>
+              </w:rPr>
+              <w:t xml:space="preserve">Show a note</w:t>
+            </w:r>
+            <w:r>
+              <w:t xml:space="preserve">.</w:t>
             </w:r>
           </w:p>
         </w:tc>
@@ -3028,8 +3158,8 @@
         </w:tc>
       </w:tr>
     </w:tbl>
-    <w:bookmarkEnd w:id="31"/>
     <w:bookmarkEnd w:id="32"/>
+    <w:bookmarkEnd w:id="33"/>
     <w:sectPr>
       <w:footerReference r:id="rId9" w:type="default"/>
       <w:pgSz w:h="15840" w:orient="portrait" w:w="12240"/>

</xml_diff>

<commit_message>
Kit & misc fixes
</commit_message>
<xml_diff>
--- a/docs/Boxborough News - Editor's Guide.docx
+++ b/docs/Boxborough News - Editor's Guide.docx
@@ -2276,7 +2276,7 @@
         <w:t xml:space="preserve"> </w:t>
       </w:r>
       <w:r>
-        <w:t xml:space="preserve">page (linked from the Events page, the footer and Contact) asks organizations for exactly these details. Until a submission form is set up, its button opens an email to boxboroughnews@gmail.com with the questions already filled in. To use a Google Form instead, paste its link into</w:t>
+        <w:t xml:space="preserve">page (linked from the Events page, the footer and Contact) asks organizations for exactly these details. Until a submission form is set up, its button opens an email to info@boxboroughnews.org with the questions already filled in. To use a Google Form instead, paste its link into</w:t>
       </w:r>
       <w:r>
         <w:t xml:space="preserve"> </w:t>
@@ -4241,6 +4241,240 @@
       <w:sz w:val="25"/>
       <w:szCs w:val="25"/>
     </w:rPr>
+  </w:style>
+  <w:style w:customStyle="1" w:styleId="SourceCode" w:type="paragraph">
+    <w:name w:val="Source Code"/>
+    <w:basedOn w:val="Normal"/>
+    <w:link w:val="VerbatimChar"/>
+    <w:pPr>
+      <w:wordWrap w:val="off"/>
+    </w:pPr>
+  </w:style>
+  <w:style w:customStyle="1" w:styleId="KeywordTok" w:type="character">
+    <w:name w:val="KeywordTok"/>
+    <w:basedOn w:val="VerbatimChar"/>
+    <w:rPr>
+      <w:color w:val="007020"/>
+      <w:b/>
+    </w:rPr>
+  </w:style>
+  <w:style w:customStyle="1" w:styleId="DataTypeTok" w:type="character">
+    <w:name w:val="DataTypeTok"/>
+    <w:basedOn w:val="VerbatimChar"/>
+    <w:rPr>
+      <w:color w:val="902000"/>
+    </w:rPr>
+  </w:style>
+  <w:style w:customStyle="1" w:styleId="DecValTok" w:type="character">
+    <w:name w:val="DecValTok"/>
+    <w:basedOn w:val="VerbatimChar"/>
+    <w:rPr>
+      <w:color w:val="40a070"/>
+    </w:rPr>
+  </w:style>
+  <w:style w:customStyle="1" w:styleId="BaseNTok" w:type="character">
+    <w:name w:val="BaseNTok"/>
+    <w:basedOn w:val="VerbatimChar"/>
+    <w:rPr>
+      <w:color w:val="40a070"/>
+    </w:rPr>
+  </w:style>
+  <w:style w:customStyle="1" w:styleId="FloatTok" w:type="character">
+    <w:name w:val="FloatTok"/>
+    <w:basedOn w:val="VerbatimChar"/>
+    <w:rPr>
+      <w:color w:val="40a070"/>
+    </w:rPr>
+  </w:style>
+  <w:style w:customStyle="1" w:styleId="ConstantTok" w:type="character">
+    <w:name w:val="ConstantTok"/>
+    <w:basedOn w:val="VerbatimChar"/>
+    <w:rPr>
+      <w:color w:val="880000"/>
+    </w:rPr>
+  </w:style>
+  <w:style w:customStyle="1" w:styleId="CharTok" w:type="character">
+    <w:name w:val="CharTok"/>
+    <w:basedOn w:val="VerbatimChar"/>
+    <w:rPr>
+      <w:color w:val="4070a0"/>
+    </w:rPr>
+  </w:style>
+  <w:style w:customStyle="1" w:styleId="SpecialCharTok" w:type="character">
+    <w:name w:val="SpecialCharTok"/>
+    <w:basedOn w:val="VerbatimChar"/>
+    <w:rPr>
+      <w:color w:val="4070a0"/>
+    </w:rPr>
+  </w:style>
+  <w:style w:customStyle="1" w:styleId="StringTok" w:type="character">
+    <w:name w:val="StringTok"/>
+    <w:basedOn w:val="VerbatimChar"/>
+    <w:rPr>
+      <w:color w:val="4070a0"/>
+    </w:rPr>
+  </w:style>
+  <w:style w:customStyle="1" w:styleId="VerbatimStringTok" w:type="character">
+    <w:name w:val="VerbatimStringTok"/>
+    <w:basedOn w:val="VerbatimChar"/>
+    <w:rPr>
+      <w:color w:val="4070a0"/>
+    </w:rPr>
+  </w:style>
+  <w:style w:customStyle="1" w:styleId="SpecialStringTok" w:type="character">
+    <w:name w:val="SpecialStringTok"/>
+    <w:basedOn w:val="VerbatimChar"/>
+    <w:rPr>
+      <w:color w:val="bb6688"/>
+    </w:rPr>
+  </w:style>
+  <w:style w:customStyle="1" w:styleId="ImportTok" w:type="character">
+    <w:name w:val="ImportTok"/>
+    <w:basedOn w:val="VerbatimChar"/>
+    <w:rPr>
+      <w:color w:val="008000"/>
+      <w:b/>
+    </w:rPr>
+  </w:style>
+  <w:style w:customStyle="1" w:styleId="CommentTok" w:type="character">
+    <w:name w:val="CommentTok"/>
+    <w:basedOn w:val="VerbatimChar"/>
+    <w:rPr>
+      <w:color w:val="60a0b0"/>
+      <w:i/>
+    </w:rPr>
+  </w:style>
+  <w:style w:customStyle="1" w:styleId="DocumentationTok" w:type="character">
+    <w:name w:val="DocumentationTok"/>
+    <w:basedOn w:val="VerbatimChar"/>
+    <w:rPr>
+      <w:color w:val="ba2121"/>
+      <w:i/>
+    </w:rPr>
+  </w:style>
+  <w:style w:customStyle="1" w:styleId="AnnotationTok" w:type="character">
+    <w:name w:val="AnnotationTok"/>
+    <w:basedOn w:val="VerbatimChar"/>
+    <w:rPr>
+      <w:color w:val="60a0b0"/>
+      <w:b/>
+      <w:i/>
+    </w:rPr>
+  </w:style>
+  <w:style w:customStyle="1" w:styleId="CommentVarTok" w:type="character">
+    <w:name w:val="CommentVarTok"/>
+    <w:basedOn w:val="VerbatimChar"/>
+    <w:rPr>
+      <w:color w:val="60a0b0"/>
+      <w:b/>
+      <w:i/>
+    </w:rPr>
+  </w:style>
+  <w:style w:customStyle="1" w:styleId="OtherTok" w:type="character">
+    <w:name w:val="OtherTok"/>
+    <w:basedOn w:val="VerbatimChar"/>
+    <w:rPr>
+      <w:color w:val="007020"/>
+    </w:rPr>
+  </w:style>
+  <w:style w:customStyle="1" w:styleId="FunctionTok" w:type="character">
+    <w:name w:val="FunctionTok"/>
+    <w:basedOn w:val="VerbatimChar"/>
+    <w:rPr>
+      <w:color w:val="06287e"/>
+    </w:rPr>
+  </w:style>
+  <w:style w:customStyle="1" w:styleId="VariableTok" w:type="character">
+    <w:name w:val="VariableTok"/>
+    <w:basedOn w:val="VerbatimChar"/>
+    <w:rPr>
+      <w:color w:val="19177c"/>
+    </w:rPr>
+  </w:style>
+  <w:style w:customStyle="1" w:styleId="ControlFlowTok" w:type="character">
+    <w:name w:val="ControlFlowTok"/>
+    <w:basedOn w:val="VerbatimChar"/>
+    <w:rPr>
+      <w:color w:val="007020"/>
+      <w:b/>
+    </w:rPr>
+  </w:style>
+  <w:style w:customStyle="1" w:styleId="OperatorTok" w:type="character">
+    <w:name w:val="OperatorTok"/>
+    <w:basedOn w:val="VerbatimChar"/>
+    <w:rPr>
+      <w:color w:val="666666"/>
+    </w:rPr>
+  </w:style>
+  <w:style w:customStyle="1" w:styleId="BuiltInTok" w:type="character">
+    <w:name w:val="BuiltInTok"/>
+    <w:basedOn w:val="VerbatimChar"/>
+    <w:rPr>
+      <w:color w:val="008000"/>
+    </w:rPr>
+  </w:style>
+  <w:style w:customStyle="1" w:styleId="ExtensionTok" w:type="character">
+    <w:name w:val="ExtensionTok"/>
+    <w:basedOn w:val="VerbatimChar"/>
+    <w:rPr/>
+  </w:style>
+  <w:style w:customStyle="1" w:styleId="PreprocessorTok" w:type="character">
+    <w:name w:val="PreprocessorTok"/>
+    <w:basedOn w:val="VerbatimChar"/>
+    <w:rPr>
+      <w:color w:val="bc7a00"/>
+    </w:rPr>
+  </w:style>
+  <w:style w:customStyle="1" w:styleId="AttributeTok" w:type="character">
+    <w:name w:val="AttributeTok"/>
+    <w:basedOn w:val="VerbatimChar"/>
+    <w:rPr>
+      <w:color w:val="7d9029"/>
+    </w:rPr>
+  </w:style>
+  <w:style w:customStyle="1" w:styleId="RegionMarkerTok" w:type="character">
+    <w:name w:val="RegionMarkerTok"/>
+    <w:basedOn w:val="VerbatimChar"/>
+    <w:rPr/>
+  </w:style>
+  <w:style w:customStyle="1" w:styleId="InformationTok" w:type="character">
+    <w:name w:val="InformationTok"/>
+    <w:basedOn w:val="VerbatimChar"/>
+    <w:rPr>
+      <w:color w:val="60a0b0"/>
+      <w:b/>
+      <w:i/>
+    </w:rPr>
+  </w:style>
+  <w:style w:customStyle="1" w:styleId="WarningTok" w:type="character">
+    <w:name w:val="WarningTok"/>
+    <w:basedOn w:val="VerbatimChar"/>
+    <w:rPr>
+      <w:color w:val="60a0b0"/>
+      <w:b/>
+      <w:i/>
+    </w:rPr>
+  </w:style>
+  <w:style w:customStyle="1" w:styleId="AlertTok" w:type="character">
+    <w:name w:val="AlertTok"/>
+    <w:basedOn w:val="VerbatimChar"/>
+    <w:rPr>
+      <w:color w:val="ff0000"/>
+      <w:b/>
+    </w:rPr>
+  </w:style>
+  <w:style w:customStyle="1" w:styleId="ErrorTok" w:type="character">
+    <w:name w:val="ErrorTok"/>
+    <w:basedOn w:val="VerbatimChar"/>
+    <w:rPr>
+      <w:color w:val="ff0000"/>
+      <w:b/>
+    </w:rPr>
+  </w:style>
+  <w:style w:customStyle="1" w:styleId="NormalTok" w:type="character">
+    <w:name w:val="NormalTok"/>
+    <w:basedOn w:val="VerbatimChar"/>
+    <w:rPr/>
   </w:style>
   <w:style w:customStyle="1" w:styleId="SourceCode" w:type="paragraph">
     <w:name w:val="Source Code"/>

</xml_diff>

<commit_message>
New-tab links, side-by-side photos, photo notes
</commit_message>
<xml_diff>
--- a/docs/Boxborough News - Editor's Guide.docx
+++ b/docs/Boxborough News - Editor's Guide.docx
@@ -760,7 +760,94 @@
         <w:t xml:space="preserve"> </w:t>
       </w:r>
       <w:r>
-        <w:t xml:space="preserve">(its place in the photo cell) on its own line in the Doc, where the photo should go. A photo that can’t be placed goes at the end of the article, and the Preview page’s summary says so. Docs, Word files and photos must be shared so that anyone with the link can view them, as they are now. iPhone HEIC photos can’t be read; save them as JPG.</w:t>
+        <w:t xml:space="preserve">(its place in the photo cell) on its own line in the Doc, where the photo should go. These [Photo] lines are typed in the</w:t>
+      </w:r>
+      <w:r>
+        <w:t xml:space="preserve"> </w:t>
+      </w:r>
+      <w:r>
+        <w:rPr>
+          <w:bCs/>
+          <w:b/>
+        </w:rPr>
+        <w:t xml:space="preserve">Google Doc</w:t>
+      </w:r>
+      <w:r>
+        <w:t xml:space="preserve"> </w:t>
+      </w:r>
+      <w:r>
+        <w:t xml:space="preserve">only; in Pages CMS you place photos as described under</w:t>
+      </w:r>
+      <w:r>
+        <w:t xml:space="preserve"> </w:t>
+      </w:r>
+      <w:r>
+        <w:rPr>
+          <w:iCs/>
+          <w:i/>
+        </w:rPr>
+        <w:t xml:space="preserve">Photos</w:t>
+      </w:r>
+      <w:r>
+        <w:t xml:space="preserve"> </w:t>
+      </w:r>
+      <w:r>
+        <w:t xml:space="preserve">below. Photo lines typed one right after another (with nothing between them but an optional caption line in italics) show</w:t>
+      </w:r>
+      <w:r>
+        <w:t xml:space="preserve"> </w:t>
+      </w:r>
+      <w:r>
+        <w:rPr>
+          <w:bCs/>
+          <w:b/>
+        </w:rPr>
+        <w:t xml:space="preserve">side by side</w:t>
+      </w:r>
+      <w:r>
+        <w:t xml:space="preserve"> </w:t>
+      </w:r>
+      <w:r>
+        <w:t xml:space="preserve">on the website. A photo that can’t be placed goes at the end of the article, and the Preview page’s summary says so. Docs, Word files and photos must be shared so that anyone with the link can view them, as they are now. iPhone HEIC photos can’t be read; save them as JPG.</w:t>
+      </w:r>
+    </w:p>
+    <w:p>
+      <w:pPr>
+        <w:pStyle w:val="BodyText"/>
+      </w:pPr>
+      <w:r>
+        <w:t xml:space="preserve">If the photo cell has words but no link (for example</w:t>
+      </w:r>
+      <w:r>
+        <w:t xml:space="preserve"> </w:t>
+      </w:r>
+      <w:r>
+        <w:t xml:space="preserve">“</w:t>
+      </w:r>
+      <w:r>
+        <w:t xml:space="preserve">use firestation</w:t>
+      </w:r>
+      <w:r>
+        <w:t xml:space="preserve">”</w:t>
+      </w:r>
+      <w:r>
+        <w:t xml:space="preserve">), the story comes in without a photo, and the Preview page’s summary quotes the note and suggests photos already on the site whose names or stories match. Open the article in Pages CMS, click</w:t>
+      </w:r>
+      <w:r>
+        <w:t xml:space="preserve"> </w:t>
+      </w:r>
+      <w:r>
+        <w:rPr>
+          <w:bCs/>
+          <w:b/>
+        </w:rPr>
+        <w:t xml:space="preserve">Main photo</w:t>
+      </w:r>
+      <w:r>
+        <w:t xml:space="preserve"> </w:t>
+      </w:r>
+      <w:r>
+        <w:t xml:space="preserve">and pick one. (The import always saves a fresh copy of each linked photo, named after the story, even if the same picture is already in the photo library. Importing the same story again replaces its own copy, so copies don’t pile up.)</w:t>
       </w:r>
     </w:p>
     <w:p>
@@ -1473,7 +1560,7 @@
               <w:jc w:val="left"/>
             </w:pPr>
             <w:r>
-              <w:t xml:space="preserve">Type or paste the article. Pasting from Word or Google Docs works. Use the toolbar for</w:t>
+              <w:t xml:space="preserve">Type or paste the article. Pasting from Word or Google Docs works. Select words to see buttons for</w:t>
             </w:r>
             <w:r>
               <w:t xml:space="preserve"> </w:t>
@@ -1499,7 +1586,55 @@
               <w:t xml:space="preserve">italics</w:t>
             </w:r>
             <w:r>
-              <w:t xml:space="preserve">, headings, lists and links.</w:t>
+              <w:t xml:space="preserve"> </w:t>
+            </w:r>
+            <w:r>
+              <w:t xml:space="preserve">and links. On an empty line, type</w:t>
+            </w:r>
+            <w:r>
+              <w:t xml:space="preserve"> </w:t>
+            </w:r>
+            <w:r>
+              <w:rPr>
+                <w:bCs/>
+                <w:b/>
+              </w:rPr>
+              <w:t xml:space="preserve">/</w:t>
+            </w:r>
+            <w:r>
+              <w:t xml:space="preserve"> </w:t>
+            </w:r>
+            <w:r>
+              <w:t xml:space="preserve">for headings, lists and photos. Leave the switch above the box on</w:t>
+            </w:r>
+            <w:r>
+              <w:t xml:space="preserve"> </w:t>
+            </w:r>
+            <w:r>
+              <w:rPr>
+                <w:bCs/>
+                <w:b/>
+              </w:rPr>
+              <w:t xml:space="preserve">Editor</w:t>
+            </w:r>
+            <w:r>
+              <w:t xml:space="preserve">;</w:t>
+            </w:r>
+            <w:r>
+              <w:t xml:space="preserve"> </w:t>
+            </w:r>
+            <w:r>
+              <w:rPr>
+                <w:bCs/>
+                <w:b/>
+              </w:rPr>
+              <w:t xml:space="preserve">Source</w:t>
+            </w:r>
+            <w:r>
+              <w:t xml:space="preserve"> </w:t>
+            </w:r>
+            <w:r>
+              <w:t xml:space="preserve">shows the same text as code.</w:t>
             </w:r>
           </w:p>
         </w:tc>
@@ -1545,7 +1680,7 @@
         <w:t xml:space="preserve"> </w:t>
       </w:r>
       <w:r>
-        <w:t xml:space="preserve">to link to a town document or agenda, highlight the words, click the link button, and paste the web address.</w:t>
+        <w:t xml:space="preserve">to link to a town document or agenda, highlight the words, click the link button, and paste the web address. Links to other websites open in a new tab automatically, so readers keep our page open.</w:t>
       </w:r>
     </w:p>
     <w:bookmarkStart w:id="23" w:name="previewing-before-it-goes-live"/>
@@ -1694,23 +1829,135 @@
         <w:pStyle w:val="Compact"/>
       </w:pPr>
       <w:r>
-        <w:t xml:space="preserve">To add a photo</w:t>
-      </w:r>
-      <w:r>
-        <w:t xml:space="preserve"> </w:t>
-      </w:r>
-      <w:r>
-        <w:rPr>
-          <w:iCs/>
-          <w:i/>
-        </w:rPr>
-        <w:t xml:space="preserve">inside</w:t>
-      </w:r>
-      <w:r>
-        <w:t xml:space="preserve"> </w:t>
-      </w:r>
-      <w:r>
-        <w:t xml:space="preserve">the article text, click the image button in the toolbar.</w:t>
+        <w:rPr>
+          <w:bCs/>
+          <w:b/>
+        </w:rPr>
+        <w:t xml:space="preserve">Photos inside the article text:</w:t>
+      </w:r>
+      <w:r>
+        <w:t xml:space="preserve"> </w:t>
+      </w:r>
+      <w:r>
+        <w:t xml:space="preserve">click at the start of an empty line where the photo should go, type</w:t>
+      </w:r>
+      <w:r>
+        <w:t xml:space="preserve"> </w:t>
+      </w:r>
+      <w:r>
+        <w:rPr>
+          <w:bCs/>
+          <w:b/>
+        </w:rPr>
+        <w:t xml:space="preserve">/</w:t>
+      </w:r>
+      <w:r>
+        <w:t xml:space="preserve"> </w:t>
+      </w:r>
+      <w:r>
+        <w:t xml:space="preserve">and choose</w:t>
+      </w:r>
+      <w:r>
+        <w:t xml:space="preserve"> </w:t>
+      </w:r>
+      <w:r>
+        <w:rPr>
+          <w:bCs/>
+          <w:b/>
+        </w:rPr>
+        <w:t xml:space="preserve">Image</w:t>
+      </w:r>
+      <w:r>
+        <w:t xml:space="preserve">, then pick a photo from the library or upload one. You can also drag a photo file from your computer into the text. To add a caption, type it on the next line in italics.</w:t>
+      </w:r>
+    </w:p>
+    <w:p>
+      <w:pPr>
+        <w:numPr>
+          <w:ilvl w:val="0"/>
+          <w:numId w:val="1005"/>
+        </w:numPr>
+        <w:pStyle w:val="Compact"/>
+      </w:pPr>
+      <w:r>
+        <w:rPr>
+          <w:bCs/>
+          <w:b/>
+        </w:rPr>
+        <w:t xml:space="preserve">Several photos side by side:</w:t>
+      </w:r>
+      <w:r>
+        <w:t xml:space="preserve"> </w:t>
+      </w:r>
+      <w:r>
+        <w:t xml:space="preserve">put the photos right after one another, each on its own line, with nothing between them except an optional italic caption line. On a computer they show side by side (up to three in a row, more rows if needed), all the same height and never trimmed; on a phone they stack. A single photo is shown on its own, full width. For a true collage, make it as one picture (in Canva or Google Photos, for example) and add it as one photo.</w:t>
+      </w:r>
+    </w:p>
+    <w:p>
+      <w:pPr>
+        <w:numPr>
+          <w:ilvl w:val="0"/>
+          <w:numId w:val="1005"/>
+        </w:numPr>
+        <w:pStyle w:val="Compact"/>
+      </w:pPr>
+      <w:r>
+        <w:rPr>
+          <w:bCs/>
+          <w:b/>
+        </w:rPr>
+        <w:t xml:space="preserve">The photo library:</w:t>
+      </w:r>
+      <w:r>
+        <w:t xml:space="preserve"> </w:t>
+      </w:r>
+      <w:r>
+        <w:rPr>
+          <w:bCs/>
+          <w:b/>
+        </w:rPr>
+        <w:t xml:space="preserve">Media</w:t>
+      </w:r>
+      <w:r>
+        <w:t xml:space="preserve"> </w:t>
+      </w:r>
+      <w:r>
+        <w:t xml:space="preserve">in the left menu of Pages CMS lists every stored photo. There you can upload photos without writing an article (they’re then ready to pick for any article), and make folders to keep new photos organized. Don’t rename, move or delete a photo that’s already used in an article: the article would lose its picture.</w:t>
+      </w:r>
+    </w:p>
+    <w:p>
+      <w:pPr>
+        <w:numPr>
+          <w:ilvl w:val="0"/>
+          <w:numId w:val="1005"/>
+        </w:numPr>
+        <w:pStyle w:val="Compact"/>
+      </w:pPr>
+      <w:r>
+        <w:rPr>
+          <w:bCs/>
+          <w:b/>
+        </w:rPr>
+        <w:t xml:space="preserve">Photos from Google Drive or Google Photos:</w:t>
+      </w:r>
+      <w:r>
+        <w:t xml:space="preserve"> </w:t>
+      </w:r>
+      <w:r>
+        <w:t xml:space="preserve">Pages CMS uploads from your computer, so download the photo first (in Drive or Photos, use</w:t>
+      </w:r>
+      <w:r>
+        <w:t xml:space="preserve"> </w:t>
+      </w:r>
+      <w:r>
+        <w:rPr>
+          <w:bCs/>
+          <w:b/>
+        </w:rPr>
+        <w:t xml:space="preserve">Download</w:t>
+      </w:r>
+      <w:r>
+        <w:t xml:space="preserve">), then upload it. With the tracker sheet import, Drive links are read automatically, so this step isn’t needed there.</w:t>
       </w:r>
     </w:p>
     <w:bookmarkEnd w:id="24"/>
@@ -4886,6 +5133,240 @@
       <w:sz w:val="25"/>
       <w:szCs w:val="25"/>
     </w:rPr>
+  </w:style>
+  <w:style w:customStyle="1" w:styleId="SourceCode" w:type="paragraph">
+    <w:name w:val="Source Code"/>
+    <w:basedOn w:val="Normal"/>
+    <w:link w:val="VerbatimChar"/>
+    <w:pPr>
+      <w:wordWrap w:val="off"/>
+    </w:pPr>
+  </w:style>
+  <w:style w:customStyle="1" w:styleId="KeywordTok" w:type="character">
+    <w:name w:val="KeywordTok"/>
+    <w:basedOn w:val="VerbatimChar"/>
+    <w:rPr>
+      <w:color w:val="007020"/>
+      <w:b/>
+    </w:rPr>
+  </w:style>
+  <w:style w:customStyle="1" w:styleId="DataTypeTok" w:type="character">
+    <w:name w:val="DataTypeTok"/>
+    <w:basedOn w:val="VerbatimChar"/>
+    <w:rPr>
+      <w:color w:val="902000"/>
+    </w:rPr>
+  </w:style>
+  <w:style w:customStyle="1" w:styleId="DecValTok" w:type="character">
+    <w:name w:val="DecValTok"/>
+    <w:basedOn w:val="VerbatimChar"/>
+    <w:rPr>
+      <w:color w:val="40a070"/>
+    </w:rPr>
+  </w:style>
+  <w:style w:customStyle="1" w:styleId="BaseNTok" w:type="character">
+    <w:name w:val="BaseNTok"/>
+    <w:basedOn w:val="VerbatimChar"/>
+    <w:rPr>
+      <w:color w:val="40a070"/>
+    </w:rPr>
+  </w:style>
+  <w:style w:customStyle="1" w:styleId="FloatTok" w:type="character">
+    <w:name w:val="FloatTok"/>
+    <w:basedOn w:val="VerbatimChar"/>
+    <w:rPr>
+      <w:color w:val="40a070"/>
+    </w:rPr>
+  </w:style>
+  <w:style w:customStyle="1" w:styleId="ConstantTok" w:type="character">
+    <w:name w:val="ConstantTok"/>
+    <w:basedOn w:val="VerbatimChar"/>
+    <w:rPr>
+      <w:color w:val="880000"/>
+    </w:rPr>
+  </w:style>
+  <w:style w:customStyle="1" w:styleId="CharTok" w:type="character">
+    <w:name w:val="CharTok"/>
+    <w:basedOn w:val="VerbatimChar"/>
+    <w:rPr>
+      <w:color w:val="4070a0"/>
+    </w:rPr>
+  </w:style>
+  <w:style w:customStyle="1" w:styleId="SpecialCharTok" w:type="character">
+    <w:name w:val="SpecialCharTok"/>
+    <w:basedOn w:val="VerbatimChar"/>
+    <w:rPr>
+      <w:color w:val="4070a0"/>
+    </w:rPr>
+  </w:style>
+  <w:style w:customStyle="1" w:styleId="StringTok" w:type="character">
+    <w:name w:val="StringTok"/>
+    <w:basedOn w:val="VerbatimChar"/>
+    <w:rPr>
+      <w:color w:val="4070a0"/>
+    </w:rPr>
+  </w:style>
+  <w:style w:customStyle="1" w:styleId="VerbatimStringTok" w:type="character">
+    <w:name w:val="VerbatimStringTok"/>
+    <w:basedOn w:val="VerbatimChar"/>
+    <w:rPr>
+      <w:color w:val="4070a0"/>
+    </w:rPr>
+  </w:style>
+  <w:style w:customStyle="1" w:styleId="SpecialStringTok" w:type="character">
+    <w:name w:val="SpecialStringTok"/>
+    <w:basedOn w:val="VerbatimChar"/>
+    <w:rPr>
+      <w:color w:val="bb6688"/>
+    </w:rPr>
+  </w:style>
+  <w:style w:customStyle="1" w:styleId="ImportTok" w:type="character">
+    <w:name w:val="ImportTok"/>
+    <w:basedOn w:val="VerbatimChar"/>
+    <w:rPr>
+      <w:color w:val="008000"/>
+      <w:b/>
+    </w:rPr>
+  </w:style>
+  <w:style w:customStyle="1" w:styleId="CommentTok" w:type="character">
+    <w:name w:val="CommentTok"/>
+    <w:basedOn w:val="VerbatimChar"/>
+    <w:rPr>
+      <w:color w:val="60a0b0"/>
+      <w:i/>
+    </w:rPr>
+  </w:style>
+  <w:style w:customStyle="1" w:styleId="DocumentationTok" w:type="character">
+    <w:name w:val="DocumentationTok"/>
+    <w:basedOn w:val="VerbatimChar"/>
+    <w:rPr>
+      <w:color w:val="ba2121"/>
+      <w:i/>
+    </w:rPr>
+  </w:style>
+  <w:style w:customStyle="1" w:styleId="AnnotationTok" w:type="character">
+    <w:name w:val="AnnotationTok"/>
+    <w:basedOn w:val="VerbatimChar"/>
+    <w:rPr>
+      <w:color w:val="60a0b0"/>
+      <w:b/>
+      <w:i/>
+    </w:rPr>
+  </w:style>
+  <w:style w:customStyle="1" w:styleId="CommentVarTok" w:type="character">
+    <w:name w:val="CommentVarTok"/>
+    <w:basedOn w:val="VerbatimChar"/>
+    <w:rPr>
+      <w:color w:val="60a0b0"/>
+      <w:b/>
+      <w:i/>
+    </w:rPr>
+  </w:style>
+  <w:style w:customStyle="1" w:styleId="OtherTok" w:type="character">
+    <w:name w:val="OtherTok"/>
+    <w:basedOn w:val="VerbatimChar"/>
+    <w:rPr>
+      <w:color w:val="007020"/>
+    </w:rPr>
+  </w:style>
+  <w:style w:customStyle="1" w:styleId="FunctionTok" w:type="character">
+    <w:name w:val="FunctionTok"/>
+    <w:basedOn w:val="VerbatimChar"/>
+    <w:rPr>
+      <w:color w:val="06287e"/>
+    </w:rPr>
+  </w:style>
+  <w:style w:customStyle="1" w:styleId="VariableTok" w:type="character">
+    <w:name w:val="VariableTok"/>
+    <w:basedOn w:val="VerbatimChar"/>
+    <w:rPr>
+      <w:color w:val="19177c"/>
+    </w:rPr>
+  </w:style>
+  <w:style w:customStyle="1" w:styleId="ControlFlowTok" w:type="character">
+    <w:name w:val="ControlFlowTok"/>
+    <w:basedOn w:val="VerbatimChar"/>
+    <w:rPr>
+      <w:color w:val="007020"/>
+      <w:b/>
+    </w:rPr>
+  </w:style>
+  <w:style w:customStyle="1" w:styleId="OperatorTok" w:type="character">
+    <w:name w:val="OperatorTok"/>
+    <w:basedOn w:val="VerbatimChar"/>
+    <w:rPr>
+      <w:color w:val="666666"/>
+    </w:rPr>
+  </w:style>
+  <w:style w:customStyle="1" w:styleId="BuiltInTok" w:type="character">
+    <w:name w:val="BuiltInTok"/>
+    <w:basedOn w:val="VerbatimChar"/>
+    <w:rPr>
+      <w:color w:val="008000"/>
+    </w:rPr>
+  </w:style>
+  <w:style w:customStyle="1" w:styleId="ExtensionTok" w:type="character">
+    <w:name w:val="ExtensionTok"/>
+    <w:basedOn w:val="VerbatimChar"/>
+    <w:rPr/>
+  </w:style>
+  <w:style w:customStyle="1" w:styleId="PreprocessorTok" w:type="character">
+    <w:name w:val="PreprocessorTok"/>
+    <w:basedOn w:val="VerbatimChar"/>
+    <w:rPr>
+      <w:color w:val="bc7a00"/>
+    </w:rPr>
+  </w:style>
+  <w:style w:customStyle="1" w:styleId="AttributeTok" w:type="character">
+    <w:name w:val="AttributeTok"/>
+    <w:basedOn w:val="VerbatimChar"/>
+    <w:rPr>
+      <w:color w:val="7d9029"/>
+    </w:rPr>
+  </w:style>
+  <w:style w:customStyle="1" w:styleId="RegionMarkerTok" w:type="character">
+    <w:name w:val="RegionMarkerTok"/>
+    <w:basedOn w:val="VerbatimChar"/>
+    <w:rPr/>
+  </w:style>
+  <w:style w:customStyle="1" w:styleId="InformationTok" w:type="character">
+    <w:name w:val="InformationTok"/>
+    <w:basedOn w:val="VerbatimChar"/>
+    <w:rPr>
+      <w:color w:val="60a0b0"/>
+      <w:b/>
+      <w:i/>
+    </w:rPr>
+  </w:style>
+  <w:style w:customStyle="1" w:styleId="WarningTok" w:type="character">
+    <w:name w:val="WarningTok"/>
+    <w:basedOn w:val="VerbatimChar"/>
+    <w:rPr>
+      <w:color w:val="60a0b0"/>
+      <w:b/>
+      <w:i/>
+    </w:rPr>
+  </w:style>
+  <w:style w:customStyle="1" w:styleId="AlertTok" w:type="character">
+    <w:name w:val="AlertTok"/>
+    <w:basedOn w:val="VerbatimChar"/>
+    <w:rPr>
+      <w:color w:val="ff0000"/>
+      <w:b/>
+    </w:rPr>
+  </w:style>
+  <w:style w:customStyle="1" w:styleId="ErrorTok" w:type="character">
+    <w:name w:val="ErrorTok"/>
+    <w:basedOn w:val="VerbatimChar"/>
+    <w:rPr>
+      <w:color w:val="ff0000"/>
+      <w:b/>
+    </w:rPr>
+  </w:style>
+  <w:style w:customStyle="1" w:styleId="NormalTok" w:type="character">
+    <w:name w:val="NormalTok"/>
+    <w:basedOn w:val="VerbatimChar"/>
+    <w:rPr/>
   </w:style>
   <w:style w:customStyle="1" w:styleId="SourceCode" w:type="paragraph">
     <w:name w:val="Source Code"/>

</xml_diff>